<commit_message>
fix: normalkan template docx dan perbaiki template-based exporter agar Word docx 100% valid; hapus tombol print di preview
</commit_message>
<xml_diff>
--- a/public/template_docx/TEMPLATE_BAST_PML-SM (mitra).docx
+++ b/public/template_docx/TEMPLATE_BAST_PML-SM (mitra).docx
@@ -169,29 +169,9 @@
           <w:szCs w:val="24"/>
           <w:lang w:val="en-ID"/>
         </w:rPr>
-        <w:t>&lt;&lt;NO_BAST_P</w:t>
-      </w:r>
-      <w:r>
-        <w:rPr>
-          <w:rFonts w:ascii="Bookman Old Style" w:hAnsi="Bookman Old Style" w:cs="Arial"/>
-          <w:b/>
-          <w:noProof/>
-          <w:sz w:val="24"/>
-          <w:szCs w:val="24"/>
-          <w:lang w:val="en-ID"/>
-        </w:rPr>
-        <w:t>M</w:t>
-      </w:r>
-      <w:r>
-        <w:rPr>
-          <w:rFonts w:ascii="Bookman Old Style" w:hAnsi="Bookman Old Style" w:cs="Arial"/>
-          <w:b/>
-          <w:noProof/>
-          <w:sz w:val="24"/>
-          <w:szCs w:val="24"/>
-          <w:lang w:val="en-ID"/>
-        </w:rPr>
-        <w:t>L_SM&gt;&gt;</w:t>
+        <w:t>
+          <w:t xml:space="preserve">&lt;&lt;NO_BAST_PML_SM&gt;&gt;</w:t>
+        </w:t>
       </w:r>
     </w:p>
     <w:p>
@@ -535,25 +515,9 @@
           <w:sz w:val="24"/>
           <w:szCs w:val="24"/>
         </w:rPr>
-        <w:t>&lt;&lt;NI</w:t>
-      </w:r>
-      <w:r>
-        <w:rPr>
-          <w:rFonts w:ascii="Bookman Old Style" w:hAnsi="Bookman Old Style" w:cs="Arial"/>
-          <w:noProof/>
-          <w:sz w:val="24"/>
-          <w:szCs w:val="24"/>
-        </w:rPr>
-        <w:t>K</w:t>
-      </w:r>
-      <w:r>
-        <w:rPr>
-          <w:rFonts w:ascii="Bookman Old Style" w:hAnsi="Bookman Old Style" w:cs="Arial"/>
-          <w:noProof/>
-          <w:sz w:val="24"/>
-          <w:szCs w:val="24"/>
-        </w:rPr>
-        <w:t>_PIHAK_PERTAMA&gt;&gt;</w:t>
+        <w:t>
+          <w:t xml:space="preserve">&lt;&lt;NIK_PIHAK_PERTAMA&gt;&gt;</w:t>
+        </w:t>
       </w:r>
     </w:p>
     <w:p>
@@ -933,25 +897,9 @@
           <w:szCs w:val="24"/>
           <w:lang w:val="en-US"/>
         </w:rPr>
-        <w:t>&lt;&lt;</w:t>
-      </w:r>
-      <w:r>
-        <w:rPr>
-          <w:rFonts w:ascii="Bookman Old Style" w:hAnsi="Bookman Old Style" w:cs="Times New Roman"/>
-          <w:sz w:val="24"/>
-          <w:szCs w:val="24"/>
-          <w:lang w:val="en-US"/>
-        </w:rPr>
-        <w:t>NAMA_</w:t>
-      </w:r>
-      <w:r>
-        <w:rPr>
-          <w:rFonts w:ascii="Bookman Old Style" w:hAnsi="Bookman Old Style" w:cs="Times New Roman"/>
-          <w:sz w:val="24"/>
-          <w:szCs w:val="24"/>
-          <w:lang w:val="en-US"/>
-        </w:rPr>
-        <w:t>KETUA_TIM&gt;&gt;</w:t>
+        <w:t>
+          <w:t xml:space="preserve">&lt;&lt;NAMA_KETUA_TIM&gt;&gt;</w:t>
+        </w:t>
       </w:r>
     </w:p>
     <w:p>

</xml_diff>

<commit_message>
Fix BAST docx header: move horizontal divider border to below document number
</commit_message>
<xml_diff>
--- a/public/template_docx/TEMPLATE_BAST_PML-SM (mitra).docx
+++ b/public/template_docx/TEMPLATE_BAST_PML-SM (mitra).docx
@@ -70,9 +70,6 @@
     </w:p>
     <w:p>
       <w:pPr>
-        <w:pBdr>
-          <w:bottom w:val="single" w:sz="4" w:space="1" w:color="auto"/>
-        </w:pBdr>
         <w:spacing w:after="0" w:line="276" w:lineRule="auto"/>
         <w:jc w:val="center"/>
         <w:rPr>
@@ -117,6 +114,9 @@
     </w:p>
     <w:p>
       <w:pPr>
+        <w:pBdr>
+          <w:bottom w:val="single" w:sz="8" w:space="4" w:color="auto"/>
+        </w:pBdr>
         <w:jc w:val="center"/>
         <w:rPr>
           <w:rFonts w:ascii="Bookman Old Style" w:hAnsi="Bookman Old Style" w:cs="Arial"/>

</xml_diff>

<commit_message>
Include activity period in URAIAN_PEKERJAAN and fix 'tahun <<TAHUN>>' in all BAST templates
</commit_message>
<xml_diff>
--- a/public/template_docx/TEMPLATE_BAST_PML-SM (mitra).docx
+++ b/public/template_docx/TEMPLATE_BAST_PML-SM (mitra).docx
@@ -248,7 +248,7 @@
           <w:szCs w:val="24"/>
           <w:lang w:val="en-US"/>
         </w:rPr>
-        <w:t>,</w:t>
+        <w:t>, tahun </w:t>
       </w:r>
       <w:r>
         <w:rPr>
@@ -274,7 +274,7 @@
           <w:szCs w:val="24"/>
           <w:lang w:val="en-US"/>
         </w:rPr>
-        <w:t xml:space="preserve">, </w:t>
+        <w:t xml:space="preserve">, tahun </w:t>
       </w:r>
       <w:r>
         <w:rPr>
@@ -1501,7 +1501,7 @@
           <w:sz w:val="24"/>
           <w:szCs w:val="24"/>
         </w:rPr>
-        <w:instrText xml:space="preserve"> MERGEFIELD "no_SPK" </w:instrText>
+        <w:instrText xml:space="preserve">  </w:instrText>
       </w:r>
       <w:r>
         <w:rPr>
@@ -1604,7 +1604,7 @@
           <w:sz w:val="24"/>
           <w:szCs w:val="24"/>
         </w:rPr>
-        <w:t>&lt;&lt;TAHUN&gt;&gt;</w:t>
+        <w:t>tahun &lt;&lt;TAHUN&gt;&gt;</w:t>
       </w:r>
       <w:r>
         <w:rPr>

</xml_diff>

<commit_message>
Sync docx template bold styling and header number formatting with HTML preview
</commit_message>
<xml_diff>
--- a/public/template_docx/TEMPLATE_BAST_PML-SM (mitra).docx
+++ b/public/template_docx/TEMPLATE_BAST_PML-SM (mitra).docx
@@ -235,6 +235,7 @@
       </w:r>
       <w:r>
         <w:rPr>
+          <w:b/>
           <w:rFonts w:ascii="Bookman Old Style" w:hAnsi="Bookman Old Style" w:cs="Arial"/>
           <w:sz w:val="24"/>
           <w:szCs w:val="24"/>
@@ -260,6 +261,7 @@
       </w:r>
       <w:r>
         <w:rPr>
+          <w:b/>
           <w:rFonts w:ascii="Bookman Old Style" w:hAnsi="Bookman Old Style" w:cs="Arial"/>
           <w:noProof/>
           <w:sz w:val="24"/>
@@ -286,6 +288,7 @@
       </w:r>
       <w:r>
         <w:rPr>
+          <w:b/>
           <w:rFonts w:ascii="Bookman Old Style" w:hAnsi="Bookman Old Style" w:cs="Arial"/>
           <w:noProof/>
           <w:sz w:val="24"/>
@@ -312,6 +315,7 @@
       </w:r>
       <w:r>
         <w:rPr>
+          <w:b/>
           <w:rFonts w:ascii="Bookman Old Style" w:hAnsi="Bookman Old Style" w:cs="Arial"/>
           <w:sz w:val="24"/>
           <w:szCs w:val="24"/>
@@ -329,6 +333,7 @@
       </w:r>
       <w:r>
         <w:rPr>
+          <w:b/>
           <w:rFonts w:ascii="Bookman Old Style" w:hAnsi="Bookman Old Style" w:cs="Arial"/>
           <w:sz w:val="24"/>
           <w:szCs w:val="24"/>
@@ -432,6 +437,7 @@
       </w:r>
       <w:r>
         <w:rPr>
+          <w:b/>
           <w:rFonts w:ascii="Bookman Old Style" w:hAnsi="Bookman Old Style" w:cs="Arial"/>
           <w:noProof/>
           <w:sz w:val="24"/>
@@ -645,6 +651,7 @@
       </w:r>
       <w:r>
         <w:rPr>
+          <w:b/>
           <w:rFonts w:ascii="Bookman Old Style" w:hAnsi="Bookman Old Style" w:cs="Arial"/>
           <w:noProof/>
           <w:sz w:val="24"/>
@@ -832,6 +839,7 @@
       <w:proofErr w:type="spellEnd"/>
       <w:r>
         <w:rPr>
+          <w:b/>
           <w:rFonts w:ascii="Bookman Old Style" w:hAnsi="Bookman Old Style" w:cs="Arial"/>
           <w:sz w:val="24"/>
           <w:szCs w:val="24"/>
@@ -892,6 +900,7 @@
       </w:r>
       <w:r>
         <w:rPr>
+          <w:b/>
           <w:rFonts w:ascii="Bookman Old Style" w:hAnsi="Bookman Old Style" w:cs="Times New Roman"/>
           <w:sz w:val="24"/>
           <w:szCs w:val="24"/>
@@ -1292,6 +1301,7 @@
       <w:proofErr w:type="spellEnd"/>
       <w:r>
         <w:rPr>
+          <w:b/>
           <w:rFonts w:ascii="Bookman Old Style" w:hAnsi="Bookman Old Style" w:cs="Arial"/>
           <w:sz w:val="24"/>
           <w:szCs w:val="24"/>
@@ -1352,6 +1362,7 @@
       </w:r>
       <w:r>
         <w:rPr>
+          <w:b/>
           <w:rFonts w:ascii="Bookman Old Style" w:hAnsi="Bookman Old Style" w:cs="Arial"/>
           <w:sz w:val="24"/>
           <w:szCs w:val="24"/>
@@ -1378,6 +1389,7 @@
       </w:r>
       <w:r>
         <w:rPr>
+          <w:b/>
           <w:rFonts w:ascii="Bookman Old Style" w:hAnsi="Bookman Old Style" w:cs="Arial"/>
           <w:sz w:val="24"/>
           <w:szCs w:val="24"/>
@@ -1387,6 +1399,7 @@
       </w:r>
       <w:r>
         <w:rPr>
+          <w:b/>
           <w:rFonts w:ascii="Bookman Old Style" w:hAnsi="Bookman Old Style" w:cs="Arial"/>
           <w:sz w:val="24"/>
           <w:szCs w:val="24"/>
@@ -1415,6 +1428,7 @@
       </w:r>
       <w:r>
         <w:rPr>
+          <w:b/>
           <w:rFonts w:ascii="Bookman Old Style" w:hAnsi="Bookman Old Style" w:cs="Arial"/>
           <w:noProof/>
           <w:sz w:val="24"/>
@@ -1432,6 +1446,7 @@
       </w:r>
       <w:r>
         <w:rPr>
+          <w:b/>
           <w:rFonts w:ascii="Bookman Old Style" w:hAnsi="Bookman Old Style" w:cs="Arial"/>
           <w:sz w:val="24"/>
           <w:szCs w:val="24"/>
@@ -1456,6 +1471,7 @@
       </w:pPr>
       <w:r>
         <w:rPr>
+          <w:b/>
           <w:rFonts w:ascii="Bookman Old Style" w:hAnsi="Bookman Old Style" w:cs="Arial"/>
           <w:sz w:val="24"/>
           <w:szCs w:val="24"/>
@@ -1464,6 +1480,7 @@
       </w:r>
       <w:r>
         <w:rPr>
+          <w:b/>
           <w:rFonts w:ascii="Bookman Old Style" w:hAnsi="Bookman Old Style" w:cs="Arial"/>
           <w:noProof/>
           <w:sz w:val="24"/>
@@ -1522,6 +1539,7 @@
       </w:r>
       <w:r>
         <w:rPr>
+          <w:b/>
           <w:rFonts w:ascii="Bookman Old Style" w:hAnsi="Bookman Old Style" w:cs="Arial"/>
           <w:noProof/>
           <w:sz w:val="24"/>
@@ -1556,6 +1574,7 @@
       </w:r>
       <w:r>
         <w:rPr>
+          <w:b/>
           <w:rFonts w:ascii="Bookman Old Style" w:hAnsi="Bookman Old Style" w:cs="Arial"/>
           <w:noProof/>
           <w:sz w:val="24"/>
@@ -1583,6 +1602,7 @@
       </w:r>
       <w:r>
         <w:rPr>
+          <w:b/>
           <w:rFonts w:ascii="Bookman Old Style" w:hAnsi="Bookman Old Style" w:cs="Arial"/>
           <w:sz w:val="24"/>
           <w:szCs w:val="24"/>
@@ -1600,6 +1620,7 @@
       </w:r>
       <w:r>
         <w:rPr>
+          <w:b/>
           <w:rFonts w:ascii="Bookman Old Style" w:hAnsi="Bookman Old Style" w:cs="Arial"/>
           <w:sz w:val="24"/>
           <w:szCs w:val="24"/>
@@ -1632,6 +1653,7 @@
       </w:pPr>
       <w:r>
         <w:rPr>
+          <w:b/>
           <w:rFonts w:ascii="Bookman Old Style" w:hAnsi="Bookman Old Style" w:cs="Arial"/>
           <w:sz w:val="24"/>
           <w:szCs w:val="24"/>
@@ -1640,6 +1662,7 @@
       </w:r>
       <w:r>
         <w:rPr>
+          <w:b/>
           <w:rFonts w:ascii="Bookman Old Style" w:hAnsi="Bookman Old Style" w:cs="Arial"/>
           <w:noProof/>
           <w:sz w:val="24"/>
@@ -1657,6 +1680,7 @@
       </w:r>
       <w:r>
         <w:rPr>
+          <w:b/>
           <w:rFonts w:ascii="Bookman Old Style" w:hAnsi="Bookman Old Style" w:cs="Arial"/>
           <w:sz w:val="24"/>
           <w:szCs w:val="24"/>
@@ -1838,6 +1862,7 @@
             </w:pPr>
             <w:r>
               <w:rPr>
+                <w:b/>
                 <w:rFonts w:ascii="Bookman Old Style" w:hAnsi="Bookman Old Style" w:cs="Arial"/>
                 <w:sz w:val="24"/>
                 <w:szCs w:val="24"/>
@@ -1898,6 +1923,7 @@
             </w:pPr>
             <w:r>
               <w:rPr>
+                <w:b/>
                 <w:rFonts w:ascii="Bookman Old Style" w:hAnsi="Bookman Old Style" w:cs="Times New Roman"/>
                 <w:color w:val="000000" w:themeColor="text1"/>
                 <w:sz w:val="24"/>
@@ -1961,6 +1987,7 @@
             </w:pPr>
             <w:r>
               <w:rPr>
+                <w:b/>
                 <w:rFonts w:ascii="Bookman Old Style" w:hAnsi="Bookman Old Style" w:cs="Arial"/>
                 <w:sz w:val="24"/>
                 <w:szCs w:val="24"/>
@@ -2022,6 +2049,7 @@
             </w:pPr>
             <w:r>
               <w:rPr>
+                <w:b/>
                 <w:rFonts w:ascii="Bookman Old Style" w:hAnsi="Bookman Old Style" w:cs="Arial"/>
                 <w:noProof/>
                 <w:sz w:val="24"/>

</xml_diff>

<commit_message>
Apply precise bold formatting in BAST Word templates according to requirements
</commit_message>
<xml_diff>
--- a/public/template_docx/TEMPLATE_BAST_PML-SM (mitra).docx
+++ b/public/template_docx/TEMPLATE_BAST_PML-SM (mitra).docx
@@ -39,7 +39,6 @@
         <w:jc w:val="center"/>
         <w:rPr>
           <w:rFonts w:ascii="Bookman Old Style" w:hAnsi="Bookman Old Style" w:cs="Times New Roman"/>
-          <w:b/>
           <w:color w:val="000000" w:themeColor="text1"/>
           <w:sz w:val="24"/>
           <w:szCs w:val="24"/>
@@ -49,7 +48,6 @@
       <w:r>
         <w:rPr>
           <w:rFonts w:ascii="Bookman Old Style" w:hAnsi="Bookman Old Style" w:cs="Arial"/>
-          <w:b/>
           <w:noProof/>
           <w:sz w:val="24"/>
           <w:szCs w:val="24"/>
@@ -59,7 +57,6 @@
       <w:r>
         <w:rPr>
           <w:rFonts w:ascii="Bookman Old Style" w:hAnsi="Bookman Old Style" w:cs="Times New Roman"/>
-          <w:b/>
           <w:color w:val="000000" w:themeColor="text1"/>
           <w:sz w:val="24"/>
           <w:szCs w:val="24"/>
@@ -651,7 +648,6 @@
       </w:r>
       <w:r>
         <w:rPr>
-          <w:b/>
           <w:rFonts w:ascii="Bookman Old Style" w:hAnsi="Bookman Old Style" w:cs="Arial"/>
           <w:noProof/>
           <w:sz w:val="24"/>
@@ -1338,120 +1334,43 @@
           <w:sz w:val="24"/>
           <w:szCs w:val="24"/>
         </w:rPr>
-        <w:t xml:space="preserve">Berdasarkan Surat Keputusan Kepala BPS Kota Subulussalam </w:t>
-      </w:r>
-      <w:proofErr w:type="spellStart"/>
-      <w:r>
-        <w:rPr>
-          <w:rFonts w:ascii="Bookman Old Style" w:hAnsi="Bookman Old Style" w:cs="Arial"/>
-          <w:sz w:val="24"/>
-          <w:szCs w:val="24"/>
-          <w:lang w:val="en-US"/>
-        </w:rPr>
-        <w:t>Nomor</w:t>
-      </w:r>
-      <w:proofErr w:type="spellEnd"/>
-      <w:r>
-        <w:rPr>
-          <w:rFonts w:ascii="Bookman Old Style" w:hAnsi="Bookman Old Style" w:cs="Arial"/>
-          <w:sz w:val="24"/>
-          <w:szCs w:val="24"/>
-          <w:lang w:val="en-US"/>
-        </w:rPr>
-        <w:t xml:space="preserve"> </w:t>
-      </w:r>
-      <w:r>
-        <w:rPr>
+        <w:t xml:space="preserve">Berdasarkan Surat Keputusan Kepala BPS Kota Subulussalam Nomor </w:t>
+      </w:r>
+      <w:r>
+        <w:rPr>
+          <w:rFonts w:ascii="Bookman Old Style" w:hAnsi="Bookman Old Style" w:cs="Arial"/>
           <w:b/>
-          <w:rFonts w:ascii="Bookman Old Style" w:hAnsi="Bookman Old Style" w:cs="Arial"/>
-          <w:sz w:val="24"/>
-          <w:szCs w:val="24"/>
-          <w:lang w:val="en-US"/>
-        </w:rPr>
-        <w:t>&lt;&lt;NOMOR_KEPKA&gt;&gt;</w:t>
-      </w:r>
-      <w:r>
-        <w:rPr>
-          <w:rFonts w:ascii="Bookman Old Style" w:hAnsi="Bookman Old Style" w:cs="Arial"/>
-          <w:sz w:val="24"/>
-          <w:szCs w:val="24"/>
-          <w:lang w:val="en-US"/>
-        </w:rPr>
-        <w:t xml:space="preserve"> </w:t>
-      </w:r>
-      <w:r>
-        <w:rPr>
-          <w:rFonts w:ascii="Bookman Old Style" w:hAnsi="Bookman Old Style" w:cs="Arial"/>
-          <w:sz w:val="24"/>
-          <w:szCs w:val="24"/>
-        </w:rPr>
-        <w:t xml:space="preserve">tanggal </w:t>
-      </w:r>
-      <w:r>
-        <w:rPr>
+          <w:bCs/>
+          <w:sz w:val="24"/>
+          <w:szCs w:val="24"/>
+        </w:rPr>
+        <w:t xml:space="preserve">&lt;&lt;NOMOR_KEPKA&gt;&gt;</w:t>
+      </w:r>
+      <w:r>
+        <w:rPr>
+          <w:rFonts w:ascii="Bookman Old Style" w:hAnsi="Bookman Old Style" w:cs="Arial"/>
+          <w:sz w:val="24"/>
+          <w:szCs w:val="24"/>
+        </w:rPr>
+        <w:t xml:space="preserve"> tanggal </w:t>
+      </w:r>
+      <w:r>
+        <w:rPr>
+          <w:rFonts w:ascii="Bookman Old Style" w:hAnsi="Bookman Old Style" w:cs="Arial"/>
           <w:b/>
-          <w:rFonts w:ascii="Bookman Old Style" w:hAnsi="Bookman Old Style" w:cs="Arial"/>
-          <w:sz w:val="24"/>
-          <w:szCs w:val="24"/>
-          <w:lang w:val="en-US"/>
-        </w:rPr>
-        <w:t>&lt;&lt;TANGGAL_KEPKA&gt;&gt;</w:t>
-      </w:r>
-      <w:r>
-        <w:rPr>
-          <w:b/>
-          <w:rFonts w:ascii="Bookman Old Style" w:hAnsi="Bookman Old Style" w:cs="Arial"/>
-          <w:sz w:val="24"/>
-          <w:szCs w:val="24"/>
-        </w:rPr>
-        <w:t xml:space="preserve">, bersama ini PIHAK PERTAMA telah menyerahkan pekerjaan </w:t>
-      </w:r>
-      <w:proofErr w:type="spellStart"/>
-      <w:r>
-        <w:rPr>
-          <w:rFonts w:ascii="Bookman Old Style" w:hAnsi="Bookman Old Style" w:cs="Arial"/>
-          <w:sz w:val="24"/>
-          <w:szCs w:val="24"/>
-          <w:lang w:val="en-US"/>
-        </w:rPr>
-        <w:t>hasil</w:t>
-      </w:r>
-      <w:proofErr w:type="spellEnd"/>
-      <w:r>
-        <w:rPr>
-          <w:rFonts w:ascii="Bookman Old Style" w:hAnsi="Bookman Old Style" w:cs="Arial"/>
-          <w:sz w:val="24"/>
-          <w:szCs w:val="24"/>
-          <w:lang w:val="en-US"/>
-        </w:rPr>
-        <w:t xml:space="preserve"> </w:t>
-      </w:r>
-      <w:r>
-        <w:rPr>
-          <w:b/>
-          <w:rFonts w:ascii="Bookman Old Style" w:hAnsi="Bookman Old Style" w:cs="Arial"/>
-          <w:noProof/>
-          <w:sz w:val="24"/>
-          <w:szCs w:val="24"/>
-        </w:rPr>
-        <w:t>&lt;&lt;URAIAN_PEKERJAAN&gt;&gt;</w:t>
-      </w:r>
-      <w:r>
-        <w:rPr>
-          <w:rFonts w:ascii="Bookman Old Style" w:hAnsi="Bookman Old Style" w:cs="Arial"/>
-          <w:sz w:val="24"/>
-          <w:szCs w:val="24"/>
-        </w:rPr>
-        <w:t xml:space="preserve">  </w:t>
-      </w:r>
-      <w:r>
-        <w:rPr>
-          <w:b/>
-          <w:rFonts w:ascii="Bookman Old Style" w:hAnsi="Bookman Old Style" w:cs="Arial"/>
-          <w:sz w:val="24"/>
-          <w:szCs w:val="24"/>
-        </w:rPr>
-        <w:t>kepada PIHAK KEDUA, dengan ketentuan sebagai berikut:</w:t>
+          <w:bCs/>
+          <w:sz w:val="24"/>
+          <w:szCs w:val="24"/>
+        </w:rPr>
+        <w:t xml:space="preserve">&lt;&lt;TANGGAL_KEPKA&gt;&gt;</w:t>
+      </w:r>
+      <w:r>
+        <w:rPr>
+          <w:rFonts w:ascii="Bookman Old Style" w:hAnsi="Bookman Old Style" w:cs="Arial"/>
+          <w:sz w:val="24"/>
+          <w:szCs w:val="24"/>
+        </w:rPr>
+        <w:t xml:space="preserve">, bersama ini PIHAK PERTAMA telah menyerahkan pekerjaan hasil pekerjaan kepada PIHAK KEDUA, dengan ketentuan sebagai berikut:</w:t>
       </w:r>
     </w:p>
     <w:p>
@@ -1471,169 +1390,101 @@
       </w:pPr>
       <w:r>
         <w:rPr>
+          <w:rFonts w:ascii="Bookman Old Style" w:hAnsi="Bookman Old Style" w:cs="Arial"/>
+          <w:sz w:val="24"/>
+          <w:szCs w:val="24"/>
+        </w:rPr>
+        <w:t xml:space="preserve">PIHAK PERTAMA telah melaksanakan pekerjaan </w:t>
+      </w:r>
+      <w:r>
+        <w:rPr>
+          <w:rFonts w:ascii="Bookman Old Style" w:hAnsi="Bookman Old Style" w:cs="Arial"/>
           <w:b/>
-          <w:rFonts w:ascii="Bookman Old Style" w:hAnsi="Bookman Old Style" w:cs="Arial"/>
-          <w:sz w:val="24"/>
-          <w:szCs w:val="24"/>
-        </w:rPr>
-        <w:t xml:space="preserve">PIHAK PERTAMA telah melaksanakan pekerjaan </w:t>
-      </w:r>
-      <w:r>
-        <w:rPr>
+          <w:bCs/>
+          <w:sz w:val="24"/>
+          <w:szCs w:val="24"/>
+        </w:rPr>
+        <w:t xml:space="preserve">&lt;&lt;URAIAN_PEKERJAAN&gt;&gt;</w:t>
+      </w:r>
+      <w:r>
+        <w:rPr>
+          <w:rFonts w:ascii="Bookman Old Style" w:hAnsi="Bookman Old Style" w:cs="Arial"/>
+          <w:sz w:val="24"/>
+          <w:szCs w:val="24"/>
+        </w:rPr>
+        <w:t xml:space="preserve"> berdasarkan Perjanjian Kerja Nomor </w:t>
+      </w:r>
+      <w:r>
+        <w:rPr>
+          <w:rFonts w:ascii="Bookman Old Style" w:hAnsi="Bookman Old Style" w:cs="Arial"/>
           <w:b/>
-          <w:rFonts w:ascii="Bookman Old Style" w:hAnsi="Bookman Old Style" w:cs="Arial"/>
-          <w:noProof/>
-          <w:sz w:val="24"/>
-          <w:szCs w:val="24"/>
-        </w:rPr>
-        <w:t>&lt;&lt;URAIAN_PEKERJAAN&gt;&gt;</w:t>
-      </w:r>
-      <w:r>
-        <w:rPr>
-          <w:rFonts w:ascii="Bookman Old Style" w:hAnsi="Bookman Old Style" w:cs="Arial"/>
-          <w:sz w:val="24"/>
-          <w:szCs w:val="24"/>
-        </w:rPr>
-        <w:t xml:space="preserve">  </w:t>
-      </w:r>
-      <w:r>
-        <w:rPr>
-          <w:rFonts w:ascii="Bookman Old Style" w:hAnsi="Bookman Old Style" w:cs="Arial"/>
-          <w:sz w:val="24"/>
-          <w:szCs w:val="24"/>
-        </w:rPr>
-        <w:t xml:space="preserve">berdasarkan Perjanjian Kerja </w:t>
-      </w:r>
-      <w:r>
-        <w:rPr>
-          <w:rFonts w:ascii="Bookman Old Style" w:hAnsi="Bookman Old Style" w:cs="Arial"/>
-          <w:sz w:val="24"/>
-          <w:szCs w:val="24"/>
-        </w:rPr>
-        <w:fldChar w:fldCharType="begin"/>
-      </w:r>
-      <w:r>
-        <w:rPr>
-          <w:rFonts w:ascii="Bookman Old Style" w:hAnsi="Bookman Old Style" w:cs="Arial"/>
-          <w:sz w:val="24"/>
-          <w:szCs w:val="24"/>
-        </w:rPr>
-        <w:instrText xml:space="preserve">  </w:instrText>
-      </w:r>
-      <w:r>
-        <w:rPr>
-          <w:rFonts w:ascii="Bookman Old Style" w:hAnsi="Bookman Old Style" w:cs="Arial"/>
-          <w:sz w:val="24"/>
-          <w:szCs w:val="24"/>
-        </w:rPr>
-        <w:fldChar w:fldCharType="separate"/>
-      </w:r>
-      <w:r>
-        <w:rPr>
-          <w:rFonts w:ascii="Bookman Old Style" w:hAnsi="Bookman Old Style" w:cs="Arial"/>
-          <w:noProof/>
-          <w:sz w:val="24"/>
-          <w:szCs w:val="24"/>
-        </w:rPr>
-        <w:t xml:space="preserve">Nomor </w:t>
-      </w:r>
-      <w:r>
-        <w:rPr>
+          <w:bCs/>
+          <w:sz w:val="24"/>
+          <w:szCs w:val="24"/>
+        </w:rPr>
+        <w:t xml:space="preserve">&lt;&lt;NO_SPK&gt;&gt;</w:t>
+      </w:r>
+      <w:r>
+        <w:rPr>
+          <w:rFonts w:ascii="Bookman Old Style" w:hAnsi="Bookman Old Style" w:cs="Arial"/>
+          <w:sz w:val="24"/>
+          <w:szCs w:val="24"/>
+        </w:rPr>
+        <w:t xml:space="preserve">, tanggal </w:t>
+      </w:r>
+      <w:r>
+        <w:rPr>
+          <w:rFonts w:ascii="Bookman Old Style" w:hAnsi="Bookman Old Style" w:cs="Arial"/>
           <w:b/>
-          <w:rFonts w:ascii="Bookman Old Style" w:hAnsi="Bookman Old Style" w:cs="Arial"/>
-          <w:noProof/>
-          <w:sz w:val="24"/>
-          <w:szCs w:val="24"/>
-        </w:rPr>
-        <w:t>&lt;&lt;NO_SPK&gt;&gt;</w:t>
-      </w:r>
-      <w:r>
-        <w:rPr>
-          <w:rFonts w:ascii="Bookman Old Style" w:hAnsi="Bookman Old Style" w:cs="Arial"/>
-          <w:sz w:val="24"/>
-          <w:szCs w:val="24"/>
-        </w:rPr>
-        <w:fldChar w:fldCharType="end"/>
-      </w:r>
-      <w:r>
-        <w:rPr>
-          <w:rFonts w:ascii="Bookman Old Style" w:hAnsi="Bookman Old Style" w:cs="Arial"/>
-          <w:sz w:val="24"/>
-          <w:szCs w:val="24"/>
-        </w:rPr>
-        <w:t>,  tanggal</w:t>
-      </w:r>
-      <w:r>
-        <w:rPr>
-          <w:rFonts w:ascii="Bookman Old Style" w:hAnsi="Bookman Old Style" w:cs="Arial"/>
-          <w:sz w:val="24"/>
-          <w:szCs w:val="24"/>
-          <w:lang w:val="en-US"/>
-        </w:rPr>
-        <w:t xml:space="preserve"> </w:t>
-      </w:r>
-      <w:r>
-        <w:rPr>
+          <w:bCs/>
+          <w:sz w:val="24"/>
+          <w:szCs w:val="24"/>
+        </w:rPr>
+        <w:t xml:space="preserve">&lt;&lt;TANGGAL&gt;&gt;</w:t>
+      </w:r>
+      <w:r>
+        <w:rPr>
+          <w:rFonts w:ascii="Bookman Old Style" w:hAnsi="Bookman Old Style" w:cs="Arial"/>
+          <w:sz w:val="24"/>
+          <w:szCs w:val="24"/>
+        </w:rPr>
+        <w:t xml:space="preserve">, bulan </w:t>
+      </w:r>
+      <w:r>
+        <w:rPr>
+          <w:rFonts w:ascii="Bookman Old Style" w:hAnsi="Bookman Old Style" w:cs="Arial"/>
           <w:b/>
-          <w:rFonts w:ascii="Bookman Old Style" w:hAnsi="Bookman Old Style" w:cs="Arial"/>
-          <w:noProof/>
-          <w:sz w:val="24"/>
-          <w:szCs w:val="24"/>
-          <w:lang w:val="en-US"/>
-        </w:rPr>
-        <w:t>&lt;&lt;TANGGAL&gt;&gt;</w:t>
-      </w:r>
-      <w:r>
-        <w:rPr>
-          <w:rFonts w:ascii="Bookman Old Style" w:hAnsi="Bookman Old Style" w:cs="Arial"/>
-          <w:sz w:val="24"/>
-          <w:szCs w:val="24"/>
-        </w:rPr>
-        <w:t>, bulan</w:t>
-      </w:r>
-      <w:r>
-        <w:rPr>
-          <w:rFonts w:ascii="Bookman Old Style" w:hAnsi="Bookman Old Style" w:cs="Arial"/>
-          <w:sz w:val="24"/>
-          <w:szCs w:val="24"/>
-          <w:lang w:val="en-US"/>
-        </w:rPr>
-        <w:t xml:space="preserve"> </w:t>
-      </w:r>
-      <w:r>
-        <w:rPr>
+          <w:bCs/>
+          <w:sz w:val="24"/>
+          <w:szCs w:val="24"/>
+        </w:rPr>
+        <w:t xml:space="preserve">&lt;&lt;BULAN&gt;&gt;</w:t>
+      </w:r>
+      <w:r>
+        <w:rPr>
+          <w:rFonts w:ascii="Bookman Old Style" w:hAnsi="Bookman Old Style" w:cs="Arial"/>
+          <w:sz w:val="24"/>
+          <w:szCs w:val="24"/>
+        </w:rPr>
+        <w:t xml:space="preserve">, tahun </w:t>
+      </w:r>
+      <w:r>
+        <w:rPr>
+          <w:rFonts w:ascii="Bookman Old Style" w:hAnsi="Bookman Old Style" w:cs="Arial"/>
           <w:b/>
-          <w:rFonts w:ascii="Bookman Old Style" w:hAnsi="Bookman Old Style" w:cs="Arial"/>
-          <w:sz w:val="24"/>
-          <w:szCs w:val="24"/>
-          <w:lang w:val="en-US"/>
-        </w:rPr>
-        <w:t>&lt;&lt;BULAN&gt;&gt;</w:t>
-      </w:r>
-      <w:r>
-        <w:rPr>
-          <w:rFonts w:ascii="Bookman Old Style" w:hAnsi="Bookman Old Style" w:cs="Arial"/>
-          <w:sz w:val="24"/>
-          <w:szCs w:val="24"/>
-        </w:rPr>
-        <w:t xml:space="preserve">, </w:t>
-      </w:r>
-      <w:r>
-        <w:rPr>
-          <w:b/>
-          <w:rFonts w:ascii="Bookman Old Style" w:hAnsi="Bookman Old Style" w:cs="Arial"/>
-          <w:sz w:val="24"/>
-          <w:szCs w:val="24"/>
-        </w:rPr>
-        <w:t>tahun &lt;&lt;TAHUN&gt;&gt;</w:t>
-      </w:r>
-      <w:r>
-        <w:rPr>
-          <w:rFonts w:ascii="Bookman Old Style" w:hAnsi="Bookman Old Style" w:cs="Arial"/>
-          <w:sz w:val="24"/>
-          <w:szCs w:val="24"/>
-        </w:rPr>
-        <w:t>;</w:t>
+          <w:bCs/>
+          <w:sz w:val="24"/>
+          <w:szCs w:val="24"/>
+        </w:rPr>
+        <w:t xml:space="preserve">&lt;&lt;TAHUN&gt;&gt;</w:t>
+      </w:r>
+      <w:r>
+        <w:rPr>
+          <w:rFonts w:ascii="Bookman Old Style" w:hAnsi="Bookman Old Style" w:cs="Arial"/>
+          <w:sz w:val="24"/>
+          <w:szCs w:val="24"/>
+        </w:rPr>
+        <w:t xml:space="preserve">;</w:t>
       </w:r>
     </w:p>
     <w:p>
@@ -1653,39 +1504,11 @@
       </w:pPr>
       <w:r>
         <w:rPr>
-          <w:b/>
-          <w:rFonts w:ascii="Bookman Old Style" w:hAnsi="Bookman Old Style" w:cs="Arial"/>
-          <w:sz w:val="24"/>
-          <w:szCs w:val="24"/>
-        </w:rPr>
-        <w:t xml:space="preserve">Berdasarkan angka 1 tersebut di atas, PIHAK PERTAMA menyerahkan hasil pekerjaan </w:t>
-      </w:r>
-      <w:r>
-        <w:rPr>
-          <w:b/>
-          <w:rFonts w:ascii="Bookman Old Style" w:hAnsi="Bookman Old Style" w:cs="Arial"/>
-          <w:noProof/>
-          <w:sz w:val="24"/>
-          <w:szCs w:val="24"/>
-        </w:rPr>
-        <w:t>&lt;&lt;URAIAN_PEKERJAAN&gt;&gt;</w:t>
-      </w:r>
-      <w:r>
-        <w:rPr>
-          <w:rFonts w:ascii="Bookman Old Style" w:hAnsi="Bookman Old Style" w:cs="Arial"/>
-          <w:sz w:val="24"/>
-          <w:szCs w:val="24"/>
-        </w:rPr>
-        <w:t xml:space="preserve"> </w:t>
-      </w:r>
-      <w:r>
-        <w:rPr>
-          <w:b/>
-          <w:rFonts w:ascii="Bookman Old Style" w:hAnsi="Bookman Old Style" w:cs="Arial"/>
-          <w:sz w:val="24"/>
-          <w:szCs w:val="24"/>
-        </w:rPr>
-        <w:t>kepada PIHAK KEDUA, dan PIHAK KEDUA menerima hasil pekerjaan tersebut yang telah sesuai dengan seharusnya;</w:t>
+          <w:rFonts w:ascii="Bookman Old Style" w:hAnsi="Bookman Old Style" w:cs="Arial"/>
+          <w:sz w:val="24"/>
+          <w:szCs w:val="24"/>
+        </w:rPr>
+        <w:t xml:space="preserve">Berdasarkan angka 1 tersebut di atas, PIHAK PERTAMA menyerahkan hasil pekerjaan kepada PIHAK KEDUA, dan PIHAK KEDUA menerima hasil pekerjaan tersebut yang telah sesuai dengan seharusnya;</w:t>
       </w:r>
     </w:p>
     <w:p>

</xml_diff>